<commit_message>
CL1: fix benchmark tag defects in AT2/AT3 assessors -> all 3 pass traceability
CL1's assessor instruments already carried UoC-tagged benchmarks (AT1 passed), but AT2/AT3 had
tag-notation defects that validate-at-traceability flagged: compound tags repeated the section
inside ([ICTCLD401 PE 1, PE 2], [... FS Learning, FS Planning..., FS Self-management skills],
[ICTCLD502 PE 1, PE 2, PE 4], [... PE 3, PE 5]) producing phantom 'PE PE'/'FS FS' refs, and AT3's
KE question tags were abbreviated ([KE 4]..[KE 9] missing the unit). Corrected the affected text
runs in place. All three CL1 ATs now pass validate-at-traceability.

Co-Authored-By: Claude Opus 4.8 (1M context) <noreply@anthropic.com>
</commit_message>
<xml_diff>
--- a/S1-CL1-Cloud-Design-Build/assessments/AT2/AT2-Deployment-Assessor.docx
+++ b/S1-CL1-Cloud-Design-Build/assessments/AT2/AT2-Deployment-Assessor.docx
@@ -8993,7 +8993,7 @@
         <w:rPr>
           <w:color w:val="auto"/>
         </w:rPr>
-        <w:t xml:space="preserve"> [ICTCLD401 PE 1, PE 2]. </w:t>
+        <w:t xml:space="preserve"> [ICTCLD401 PE 1, 2]. </w:t>
       </w:r>
       <w:r>
         <w:rPr>
@@ -9712,7 +9712,7 @@
         <w:rPr>
           <w:color w:val="auto"/>
         </w:rPr>
-        <w:t xml:space="preserve"> [ICTCLD401 FS Learning, FS Planning and organising, FS Self-management skills].</w:t>
+        <w:t xml:space="preserve"> [ICTCLD401 FS Learning, Planning and organising, Self-management skills].</w:t>
       </w:r>
     </w:p>
     <w:p>

</xml_diff>